<commit_message>
Envio de arquivos de código.
</commit_message>
<xml_diff>
--- a/Hackathon/Big_Data_2025/docs/Hackathon Forecast Big Data 2025 - Desafio Tecnico.docx
+++ b/Hackathon/Big_Data_2025/docs/Hackathon Forecast Big Data 2025 - Desafio Tecnico.docx
@@ -347,7 +347,160 @@
         <w:rPr>
           <w:rFonts w:ascii="Arial" w:hAnsi="Arial" w:cs="Arial"/>
         </w:rPr>
-        <w:t>1 ano de dados transacionais (2022) contendo: Data da transação, PDV, Produto, Quantidade, Faturamento.</w:t>
+        <w:t>1 ano de dados transacionais (2022)</w:t>
+      </w:r>
+      <w:r>
+        <w:rPr>
+          <w:rFonts w:ascii="Arial" w:hAnsi="Arial" w:cs="Arial"/>
+        </w:rPr>
+        <w:t>(transações_2022.parquet)</w:t>
+      </w:r>
+      <w:r>
+        <w:rPr>
+          <w:rFonts w:ascii="Arial" w:hAnsi="Arial" w:cs="Arial"/>
+        </w:rPr>
+        <w:t xml:space="preserve"> contendo: </w:t>
+      </w:r>
+    </w:p>
+    <w:p>
+      <w:pPr>
+        <w:spacing w:after="0" w:line="240" w:lineRule="auto"/>
+        <w:ind w:left="720"/>
+        <w:rPr>
+          <w:rFonts w:ascii="Arial" w:hAnsi="Arial" w:cs="Arial"/>
+        </w:rPr>
+      </w:pPr>
+      <w:r>
+        <w:rPr>
+          <w:rFonts w:ascii="Arial" w:hAnsi="Arial" w:cs="Arial"/>
+        </w:rPr>
+        <w:t xml:space="preserve">* </w:t>
+      </w:r>
+      <w:r>
+        <w:rPr>
+          <w:rFonts w:ascii="Arial" w:hAnsi="Arial" w:cs="Arial"/>
+        </w:rPr>
+        <w:t>Data da transação</w:t>
+      </w:r>
+      <w:r>
+        <w:rPr>
+          <w:rFonts w:ascii="Arial" w:hAnsi="Arial" w:cs="Arial"/>
+        </w:rPr>
+        <w:t xml:space="preserve"> (transaction_date)</w:t>
+      </w:r>
+    </w:p>
+    <w:p>
+      <w:pPr>
+        <w:spacing w:after="0" w:line="240" w:lineRule="auto"/>
+        <w:ind w:left="720"/>
+        <w:rPr>
+          <w:rFonts w:ascii="Arial" w:hAnsi="Arial" w:cs="Arial"/>
+        </w:rPr>
+      </w:pPr>
+      <w:r>
+        <w:rPr>
+          <w:rFonts w:ascii="Arial" w:hAnsi="Arial" w:cs="Arial"/>
+        </w:rPr>
+        <w:t xml:space="preserve">* </w:t>
+      </w:r>
+      <w:r>
+        <w:rPr>
+          <w:rFonts w:ascii="Arial" w:hAnsi="Arial" w:cs="Arial"/>
+        </w:rPr>
+        <w:t>PDV</w:t>
+      </w:r>
+      <w:r>
+        <w:rPr>
+          <w:rFonts w:ascii="Arial" w:hAnsi="Arial" w:cs="Arial"/>
+        </w:rPr>
+        <w:t xml:space="preserve"> (internal_store_id)</w:t>
+      </w:r>
+    </w:p>
+    <w:p>
+      <w:pPr>
+        <w:spacing w:after="0" w:line="240" w:lineRule="auto"/>
+        <w:ind w:left="720"/>
+        <w:rPr>
+          <w:rFonts w:ascii="Arial" w:hAnsi="Arial" w:cs="Arial"/>
+        </w:rPr>
+      </w:pPr>
+      <w:r>
+        <w:rPr>
+          <w:rFonts w:ascii="Arial" w:hAnsi="Arial" w:cs="Arial"/>
+        </w:rPr>
+        <w:t xml:space="preserve">* </w:t>
+      </w:r>
+      <w:r>
+        <w:rPr>
+          <w:rFonts w:ascii="Arial" w:hAnsi="Arial" w:cs="Arial"/>
+        </w:rPr>
+        <w:t>Produto</w:t>
+      </w:r>
+      <w:r>
+        <w:rPr>
+          <w:rFonts w:ascii="Arial" w:hAnsi="Arial" w:cs="Arial"/>
+        </w:rPr>
+        <w:t xml:space="preserve"> (internal_product_id)</w:t>
+      </w:r>
+    </w:p>
+    <w:p>
+      <w:pPr>
+        <w:spacing w:after="0" w:line="240" w:lineRule="auto"/>
+        <w:ind w:left="720"/>
+        <w:rPr>
+          <w:rFonts w:ascii="Arial" w:hAnsi="Arial" w:cs="Arial"/>
+        </w:rPr>
+      </w:pPr>
+      <w:r>
+        <w:rPr>
+          <w:rFonts w:ascii="Arial" w:hAnsi="Arial" w:cs="Arial"/>
+        </w:rPr>
+        <w:t xml:space="preserve">* </w:t>
+      </w:r>
+      <w:r>
+        <w:rPr>
+          <w:rFonts w:ascii="Arial" w:hAnsi="Arial" w:cs="Arial"/>
+        </w:rPr>
+        <w:t>Quantidade</w:t>
+      </w:r>
+      <w:r>
+        <w:rPr>
+          <w:rFonts w:ascii="Arial" w:hAnsi="Arial" w:cs="Arial"/>
+        </w:rPr>
+        <w:t xml:space="preserve"> (quantity)</w:t>
+      </w:r>
+    </w:p>
+    <w:p>
+      <w:pPr>
+        <w:spacing w:after="0" w:line="240" w:lineRule="auto"/>
+        <w:ind w:left="720"/>
+        <w:rPr>
+          <w:rFonts w:ascii="Arial" w:hAnsi="Arial" w:cs="Arial"/>
+        </w:rPr>
+      </w:pPr>
+      <w:r>
+        <w:rPr>
+          <w:rFonts w:ascii="Arial" w:hAnsi="Arial" w:cs="Arial"/>
+        </w:rPr>
+        <w:t xml:space="preserve">* </w:t>
+      </w:r>
+      <w:r>
+        <w:rPr>
+          <w:rFonts w:ascii="Arial" w:hAnsi="Arial" w:cs="Arial"/>
+        </w:rPr>
+        <w:t>Faturamento</w:t>
+      </w:r>
+      <w:r>
+        <w:rPr>
+          <w:rFonts w:ascii="Arial" w:hAnsi="Arial" w:cs="Arial"/>
+        </w:rPr>
+        <w:t xml:space="preserve"> (gross_value)</w:t>
+      </w:r>
+      <w:r>
+        <w:rPr>
+          <w:rFonts w:ascii="Arial" w:hAnsi="Arial" w:cs="Arial"/>
+        </w:rPr>
+        <w:t>.</w:t>
       </w:r>
     </w:p>
     <w:p>
@@ -365,7 +518,187 @@
         <w:rPr>
           <w:rFonts w:ascii="Arial" w:hAnsi="Arial" w:cs="Arial"/>
         </w:rPr>
-        <w:t>Cadastro de produtos: Produto, Categoria, Descrição e até 4 características adicionais.</w:t>
+        <w:t>Cadastro de produtos</w:t>
+      </w:r>
+      <w:r>
+        <w:rPr>
+          <w:rFonts w:ascii="Arial" w:hAnsi="Arial" w:cs="Arial"/>
+        </w:rPr>
+        <w:t xml:space="preserve"> (produtos.parquet)</w:t>
+      </w:r>
+      <w:r>
+        <w:rPr>
+          <w:rFonts w:ascii="Arial" w:hAnsi="Arial" w:cs="Arial"/>
+        </w:rPr>
+        <w:t xml:space="preserve">: </w:t>
+      </w:r>
+    </w:p>
+    <w:p>
+      <w:pPr>
+        <w:spacing w:after="0" w:line="240" w:lineRule="auto"/>
+        <w:ind w:left="720"/>
+        <w:rPr>
+          <w:rFonts w:ascii="Arial" w:hAnsi="Arial" w:cs="Arial"/>
+        </w:rPr>
+      </w:pPr>
+      <w:r>
+        <w:rPr>
+          <w:rFonts w:ascii="Arial" w:hAnsi="Arial" w:cs="Arial"/>
+        </w:rPr>
+        <w:t>* p</w:t>
+      </w:r>
+      <w:r>
+        <w:rPr>
+          <w:rFonts w:ascii="Arial" w:hAnsi="Arial" w:cs="Arial"/>
+        </w:rPr>
+        <w:t>roduto</w:t>
+      </w:r>
+    </w:p>
+    <w:p>
+      <w:pPr>
+        <w:spacing w:after="0" w:line="240" w:lineRule="auto"/>
+        <w:ind w:left="720"/>
+        <w:rPr>
+          <w:rFonts w:ascii="Arial" w:hAnsi="Arial" w:cs="Arial"/>
+        </w:rPr>
+      </w:pPr>
+      <w:r>
+        <w:rPr>
+          <w:rFonts w:ascii="Arial" w:hAnsi="Arial" w:cs="Arial"/>
+        </w:rPr>
+        <w:t>* c</w:t>
+      </w:r>
+      <w:r>
+        <w:rPr>
+          <w:rFonts w:ascii="Arial" w:hAnsi="Arial" w:cs="Arial"/>
+        </w:rPr>
+        <w:t>ategoria</w:t>
+      </w:r>
+    </w:p>
+    <w:p>
+      <w:pPr>
+        <w:spacing w:after="0" w:line="240" w:lineRule="auto"/>
+        <w:ind w:left="720"/>
+        <w:rPr>
+          <w:rFonts w:ascii="Arial" w:hAnsi="Arial" w:cs="Arial"/>
+        </w:rPr>
+      </w:pPr>
+      <w:r>
+        <w:rPr>
+          <w:rFonts w:ascii="Arial" w:hAnsi="Arial" w:cs="Arial"/>
+        </w:rPr>
+        <w:t>* descricao</w:t>
+      </w:r>
+    </w:p>
+    <w:p>
+      <w:pPr>
+        <w:spacing w:after="0" w:line="240" w:lineRule="auto"/>
+        <w:ind w:left="720"/>
+        <w:rPr>
+          <w:rFonts w:ascii="Arial" w:hAnsi="Arial" w:cs="Arial"/>
+        </w:rPr>
+      </w:pPr>
+      <w:r>
+        <w:rPr>
+          <w:rFonts w:ascii="Arial" w:hAnsi="Arial" w:cs="Arial"/>
+        </w:rPr>
+        <w:t xml:space="preserve">* </w:t>
+      </w:r>
+      <w:r>
+        <w:rPr>
+          <w:rFonts w:ascii="Arial" w:hAnsi="Arial" w:cs="Arial"/>
+        </w:rPr>
+        <w:t>tipos</w:t>
+      </w:r>
+    </w:p>
+    <w:p>
+      <w:pPr>
+        <w:spacing w:after="0" w:line="240" w:lineRule="auto"/>
+        <w:ind w:left="720"/>
+        <w:rPr>
+          <w:rFonts w:ascii="Arial" w:hAnsi="Arial" w:cs="Arial"/>
+        </w:rPr>
+      </w:pPr>
+      <w:r>
+        <w:rPr>
+          <w:rFonts w:ascii="Arial" w:hAnsi="Arial" w:cs="Arial"/>
+        </w:rPr>
+        <w:t xml:space="preserve">* </w:t>
+      </w:r>
+      <w:r>
+        <w:rPr>
+          <w:rFonts w:ascii="Arial" w:hAnsi="Arial" w:cs="Arial"/>
+        </w:rPr>
+        <w:t>label</w:t>
+      </w:r>
+    </w:p>
+    <w:p>
+      <w:pPr>
+        <w:spacing w:after="0" w:line="240" w:lineRule="auto"/>
+        <w:ind w:left="720"/>
+        <w:rPr>
+          <w:rFonts w:ascii="Arial" w:hAnsi="Arial" w:cs="Arial"/>
+        </w:rPr>
+      </w:pPr>
+      <w:r>
+        <w:rPr>
+          <w:rFonts w:ascii="Arial" w:hAnsi="Arial" w:cs="Arial"/>
+        </w:rPr>
+        <w:t xml:space="preserve">* </w:t>
+      </w:r>
+      <w:r>
+        <w:rPr>
+          <w:rFonts w:ascii="Arial" w:hAnsi="Arial" w:cs="Arial"/>
+        </w:rPr>
+        <w:t>subcategoria</w:t>
+      </w:r>
+    </w:p>
+    <w:p>
+      <w:pPr>
+        <w:spacing w:after="0" w:line="240" w:lineRule="auto"/>
+        <w:ind w:left="720"/>
+        <w:rPr>
+          <w:rFonts w:ascii="Arial" w:hAnsi="Arial" w:cs="Arial"/>
+        </w:rPr>
+      </w:pPr>
+      <w:r>
+        <w:rPr>
+          <w:rFonts w:ascii="Arial" w:hAnsi="Arial" w:cs="Arial"/>
+        </w:rPr>
+        <w:t xml:space="preserve">* </w:t>
+      </w:r>
+      <w:r>
+        <w:rPr>
+          <w:rFonts w:ascii="Arial" w:hAnsi="Arial" w:cs="Arial"/>
+        </w:rPr>
+        <w:t>marca</w:t>
+      </w:r>
+    </w:p>
+    <w:p>
+      <w:pPr>
+        <w:spacing w:after="0" w:line="240" w:lineRule="auto"/>
+        <w:ind w:left="720"/>
+        <w:rPr>
+          <w:rFonts w:ascii="Arial" w:hAnsi="Arial" w:cs="Arial"/>
+        </w:rPr>
+      </w:pPr>
+      <w:r>
+        <w:rPr>
+          <w:rFonts w:ascii="Arial" w:hAnsi="Arial" w:cs="Arial"/>
+        </w:rPr>
+        <w:t xml:space="preserve">* </w:t>
+      </w:r>
+      <w:r>
+        <w:rPr>
+          <w:rFonts w:ascii="Arial" w:hAnsi="Arial" w:cs="Arial"/>
+        </w:rPr>
+        <w:t>fabricante</w:t>
+      </w:r>
+      <w:r>
+        <w:rPr>
+          <w:rFonts w:ascii="Arial" w:hAnsi="Arial" w:cs="Arial"/>
+        </w:rPr>
+        <w:t>.</w:t>
       </w:r>
     </w:p>
     <w:p>
@@ -383,8 +716,193 @@
         <w:rPr>
           <w:rFonts w:ascii="Arial" w:hAnsi="Arial" w:cs="Arial"/>
         </w:rPr>
-        <w:t>Cadastro de PDVs: PDV, On/Off Prem, Categoria PDV (c-store, g-store, liquor, etc), Zipcode.</w:t>
-      </w:r>
+        <w:t>Cadastro de PDVs</w:t>
+      </w:r>
+      <w:r>
+        <w:rPr>
+          <w:rFonts w:ascii="Arial" w:hAnsi="Arial" w:cs="Arial"/>
+        </w:rPr>
+        <w:t xml:space="preserve"> (pdvs.parquet)</w:t>
+      </w:r>
+      <w:r>
+        <w:rPr>
+          <w:rFonts w:ascii="Arial" w:hAnsi="Arial" w:cs="Arial"/>
+        </w:rPr>
+        <w:t xml:space="preserve">: </w:t>
+      </w:r>
+    </w:p>
+    <w:p>
+      <w:pPr>
+        <w:spacing w:after="0" w:line="240" w:lineRule="auto"/>
+        <w:ind w:left="720"/>
+        <w:rPr>
+          <w:rFonts w:ascii="Arial" w:hAnsi="Arial" w:cs="Arial"/>
+        </w:rPr>
+      </w:pPr>
+      <w:r>
+        <w:rPr>
+          <w:rFonts w:ascii="Arial" w:hAnsi="Arial" w:cs="Arial"/>
+        </w:rPr>
+        <w:t>* pdv</w:t>
+      </w:r>
+    </w:p>
+    <w:p>
+      <w:pPr>
+        <w:spacing w:after="0" w:line="240" w:lineRule="auto"/>
+        <w:ind w:left="720"/>
+        <w:rPr>
+          <w:rFonts w:ascii="Arial" w:hAnsi="Arial" w:cs="Arial"/>
+        </w:rPr>
+      </w:pPr>
+      <w:r>
+        <w:rPr>
+          <w:rFonts w:ascii="Arial" w:hAnsi="Arial" w:cs="Arial"/>
+        </w:rPr>
+        <w:t>* p</w:t>
+      </w:r>
+      <w:r>
+        <w:rPr>
+          <w:rFonts w:ascii="Arial" w:hAnsi="Arial" w:cs="Arial"/>
+        </w:rPr>
+        <w:t>rem</w:t>
+      </w:r>
+      <w:r>
+        <w:rPr>
+          <w:rFonts w:ascii="Arial" w:hAnsi="Arial" w:cs="Arial"/>
+        </w:rPr>
+        <w:t>ise</w:t>
+      </w:r>
+    </w:p>
+    <w:p>
+      <w:pPr>
+        <w:spacing w:after="0" w:line="240" w:lineRule="auto"/>
+        <w:ind w:left="720"/>
+        <w:rPr>
+          <w:rFonts w:ascii="Arial" w:hAnsi="Arial" w:cs="Arial"/>
+        </w:rPr>
+      </w:pPr>
+      <w:r>
+        <w:rPr>
+          <w:rFonts w:ascii="Arial" w:hAnsi="Arial" w:cs="Arial"/>
+        </w:rPr>
+        <w:t>* categoria_pdv</w:t>
+      </w:r>
+    </w:p>
+    <w:p>
+      <w:pPr>
+        <w:spacing w:after="0" w:line="240" w:lineRule="auto"/>
+        <w:ind w:left="720"/>
+        <w:rPr>
+          <w:rFonts w:ascii="Arial" w:hAnsi="Arial" w:cs="Arial"/>
+        </w:rPr>
+      </w:pPr>
+      <w:r>
+        <w:rPr>
+          <w:rFonts w:ascii="Arial" w:hAnsi="Arial" w:cs="Arial"/>
+        </w:rPr>
+        <w:t>* z</w:t>
+      </w:r>
+      <w:r>
+        <w:rPr>
+          <w:rFonts w:ascii="Arial" w:hAnsi="Arial" w:cs="Arial"/>
+        </w:rPr>
+        <w:t>ipcode.</w:t>
+      </w:r>
+    </w:p>
+    <w:p>
+      <w:pPr>
+        <w:spacing w:after="0" w:line="240" w:lineRule="auto"/>
+        <w:ind w:left="720"/>
+        <w:rPr>
+          <w:rFonts w:ascii="Arial" w:hAnsi="Arial" w:cs="Arial"/>
+        </w:rPr>
+      </w:pPr>
+    </w:p>
+    <w:p>
+      <w:pPr>
+        <w:spacing w:after="0" w:line="240" w:lineRule="auto"/>
+        <w:ind w:left="360"/>
+        <w:rPr>
+          <w:rFonts w:ascii="Arial" w:hAnsi="Arial" w:cs="Arial"/>
+        </w:rPr>
+      </w:pPr>
+      <w:r>
+        <w:rPr>
+          <w:rFonts w:ascii="Arial" w:hAnsi="Arial" w:cs="Arial"/>
+        </w:rPr>
+        <w:t>Obs.: Ligações entre os BDs, entre as chaves primárias e secundárias.</w:t>
+      </w:r>
+    </w:p>
+    <w:p>
+      <w:pPr>
+        <w:pStyle w:val="PargrafodaLista"/>
+        <w:numPr>
+          <w:ilvl w:val="0"/>
+          <w:numId w:val="12"/>
+        </w:numPr>
+        <w:tabs>
+          <w:tab w:val="left" w:pos="1276"/>
+        </w:tabs>
+        <w:spacing w:after="0" w:line="240" w:lineRule="auto"/>
+        <w:ind w:left="993" w:firstLine="0"/>
+        <w:rPr>
+          <w:rFonts w:ascii="Arial" w:hAnsi="Arial" w:cs="Arial"/>
+        </w:rPr>
+      </w:pPr>
+      <w:r>
+        <w:rPr>
+          <w:rFonts w:ascii="Arial" w:hAnsi="Arial" w:cs="Arial"/>
+        </w:rPr>
+        <w:t xml:space="preserve">pdv (chave primária) -&gt; </w:t>
+      </w:r>
+      <w:r>
+        <w:rPr>
+          <w:rFonts w:ascii="Arial" w:hAnsi="Arial" w:cs="Arial"/>
+        </w:rPr>
+        <w:t>internal_store_id</w:t>
+      </w:r>
+      <w:r>
+        <w:rPr>
+          <w:rFonts w:ascii="Arial" w:hAnsi="Arial" w:cs="Arial"/>
+        </w:rPr>
+        <w:t xml:space="preserve"> (chave secundária)</w:t>
+      </w:r>
+    </w:p>
+    <w:p>
+      <w:pPr>
+        <w:pStyle w:val="PargrafodaLista"/>
+        <w:numPr>
+          <w:ilvl w:val="0"/>
+          <w:numId w:val="12"/>
+        </w:numPr>
+        <w:tabs>
+          <w:tab w:val="left" w:pos="1276"/>
+        </w:tabs>
+        <w:spacing w:after="0" w:line="240" w:lineRule="auto"/>
+        <w:ind w:left="993" w:firstLine="0"/>
+        <w:rPr>
+          <w:rFonts w:ascii="Arial" w:hAnsi="Arial" w:cs="Arial"/>
+        </w:rPr>
+      </w:pPr>
+      <w:r>
+        <w:rPr>
+          <w:rFonts w:ascii="Arial" w:hAnsi="Arial" w:cs="Arial"/>
+        </w:rPr>
+        <w:t>produto (chave primária) -&gt; internal_product_id (chave secundária)</w:t>
+      </w:r>
+    </w:p>
+    <w:p>
+      <w:pPr>
+        <w:pStyle w:val="PargrafodaLista"/>
+        <w:tabs>
+          <w:tab w:val="left" w:pos="1276"/>
+        </w:tabs>
+        <w:spacing w:after="0" w:line="240" w:lineRule="auto"/>
+        <w:ind w:left="993"/>
+        <w:rPr>
+          <w:rFonts w:ascii="Arial" w:hAnsi="Arial" w:cs="Arial"/>
+        </w:rPr>
+      </w:pPr>
     </w:p>
     <w:p>
       <w:pPr>
@@ -560,6 +1078,7 @@
         <w:rPr>
           <w:rFonts w:ascii="Arial" w:hAnsi="Arial" w:cs="Arial"/>
         </w:rPr>
+        <w:lastRenderedPageBreak/>
         <w:t>Cadastro de PDVs: PDV, On/Off Prem, Categoria (c-store, g-store, liquor etc.), Zipcode.</w:t>
       </w:r>
     </w:p>
@@ -659,37 +1178,12 @@
     </w:p>
     <w:p>
       <w:pPr>
-        <w:spacing w:after="0" w:line="240" w:lineRule="auto"/>
-        <w:rPr>
-          <w:rFonts w:ascii="Arial" w:hAnsi="Arial" w:cs="Arial"/>
-        </w:rPr>
-      </w:pPr>
-    </w:p>
-    <w:p>
-      <w:pPr>
-        <w:spacing w:after="0" w:line="240" w:lineRule="auto"/>
-        <w:rPr>
-          <w:rFonts w:ascii="Arial" w:hAnsi="Arial" w:cs="Arial"/>
-          <w:b/>
-          <w:bCs/>
-        </w:rPr>
-      </w:pPr>
-      <w:r>
-        <w:rPr>
-          <w:rFonts w:ascii="Segoe UI Emoji" w:hAnsi="Segoe UI Emoji" w:cs="Segoe UI Emoji"/>
-          <w:b/>
-          <w:bCs/>
-        </w:rPr>
-        <w:t>📑</w:t>
-      </w:r>
-      <w:r>
-        <w:rPr>
-          <w:rFonts w:ascii="Arial" w:hAnsi="Arial" w:cs="Arial"/>
-          <w:b/>
-          <w:bCs/>
-        </w:rPr>
-        <w:t> Entregáveis</w:t>
-      </w:r>
+        <w:pStyle w:val="PargrafodaLista"/>
+        <w:spacing w:after="0" w:line="240" w:lineRule="auto"/>
+        <w:rPr>
+          <w:rFonts w:ascii="Arial" w:hAnsi="Arial" w:cs="Arial"/>
+        </w:rPr>
+      </w:pPr>
     </w:p>
     <w:p>
       <w:pPr>
@@ -701,87 +1195,240 @@
         <w:spacing w:after="0" w:line="240" w:lineRule="auto"/>
         <w:rPr>
           <w:rFonts w:ascii="Arial" w:hAnsi="Arial" w:cs="Arial"/>
-        </w:rPr>
-      </w:pPr>
-      <w:r>
-        <w:rPr>
-          <w:rFonts w:ascii="Arial" w:hAnsi="Arial" w:cs="Arial"/>
-        </w:rPr>
-        <w:t>Arquivo final </w:t>
-      </w:r>
-      <w:r>
-        <w:rPr>
-          <w:rFonts w:ascii="Arial" w:hAnsi="Arial" w:cs="Arial"/>
-          <w:b/>
-          <w:bCs/>
-        </w:rPr>
-        <w:t>.csv</w:t>
-      </w:r>
-      <w:r>
-        <w:rPr>
-          <w:rFonts w:ascii="Arial" w:hAnsi="Arial" w:cs="Arial"/>
-        </w:rPr>
-        <w:t> ou </w:t>
-      </w:r>
-      <w:r>
-        <w:rPr>
-          <w:rFonts w:ascii="Arial" w:hAnsi="Arial" w:cs="Arial"/>
-          <w:b/>
-          <w:bCs/>
-        </w:rPr>
-        <w:t>.parquet</w:t>
-      </w:r>
-      <w:r>
-        <w:rPr>
-          <w:rFonts w:ascii="Arial" w:hAnsi="Arial" w:cs="Arial"/>
-          <w:b/>
-          <w:bCs/>
+          <w:b/>
+          <w:bCs/>
+        </w:rPr>
+      </w:pPr>
+      <w:r>
+        <w:rPr>
+          <w:rFonts w:ascii="Arial" w:hAnsi="Arial" w:cs="Arial"/>
+          <w:b/>
+          <w:bCs/>
+        </w:rPr>
+        <w:t>Estrutura dos Arquivos</w:t>
+      </w:r>
+    </w:p>
+    <w:p>
+      <w:pPr>
+        <w:spacing w:after="0" w:line="240" w:lineRule="auto"/>
+        <w:ind w:left="720"/>
+        <w:rPr>
+          <w:rFonts w:ascii="Arial" w:hAnsi="Arial" w:cs="Arial"/>
+        </w:rPr>
+      </w:pPr>
+      <w:r>
+        <w:rPr>
+          <w:rFonts w:ascii="Arial" w:hAnsi="Arial" w:cs="Arial"/>
+        </w:rPr>
+        <w:t>Pasta Raiz: Big_Data_2025</w:t>
+      </w:r>
+    </w:p>
+    <w:p>
+      <w:pPr>
+        <w:spacing w:after="0" w:line="240" w:lineRule="auto"/>
+        <w:rPr>
+          <w:rFonts w:ascii="Arial" w:hAnsi="Arial" w:cs="Arial"/>
+        </w:rPr>
+      </w:pPr>
+      <w:r>
+        <w:rPr>
+          <w:rFonts w:ascii="Arial" w:eastAsia="MS Gothic" w:hAnsi="Arial" w:cs="Arial"/>
+        </w:rPr>
+        <w:t xml:space="preserve">      </w:t>
+      </w:r>
+      <w:r>
+        <w:rPr>
+          <w:rFonts w:ascii="Arial" w:eastAsia="MS Gothic" w:hAnsi="Arial" w:cs="Arial"/>
+        </w:rPr>
+        <w:t xml:space="preserve">    </w:t>
+      </w:r>
+      <w:r>
+        <w:rPr>
+          <w:rFonts w:ascii="MS Gothic" w:eastAsia="MS Gothic" w:hAnsi="MS Gothic" w:cs="MS Gothic" w:hint="eastAsia"/>
+        </w:rPr>
+        <w:t>┣</w:t>
+      </w:r>
+      <w:r>
+        <w:rPr>
+          <w:rFonts w:ascii="Arial" w:hAnsi="Arial" w:cs="Arial"/>
         </w:rPr>
         <w:t xml:space="preserve"> </w:t>
       </w:r>
       <w:r>
         <w:rPr>
-          <w:rFonts w:ascii="Arial" w:hAnsi="Arial" w:cs="Arial"/>
-          <w:b/>
-          <w:bCs/>
-          <w:i/>
-          <w:iCs/>
-        </w:rPr>
-        <w:t>(vou trabalhar com .csv</w:t>
-      </w:r>
-      <w:r>
-        <w:rPr>
-          <w:rFonts w:ascii="Arial" w:hAnsi="Arial" w:cs="Arial"/>
-          <w:b/>
-          <w:bCs/>
-          <w:i/>
-          <w:iCs/>
-        </w:rPr>
-        <w:t xml:space="preserve"> – meu arquivo final deverá ficar em .csv</w:t>
-      </w:r>
-      <w:r>
-        <w:rPr>
-          <w:rFonts w:ascii="Arial" w:hAnsi="Arial" w:cs="Arial"/>
-          <w:b/>
-          <w:bCs/>
-          <w:i/>
-          <w:iCs/>
-        </w:rPr>
-        <w:t>)</w:t>
-      </w:r>
-      <w:r>
-        <w:rPr>
-          <w:rFonts w:ascii="Arial" w:hAnsi="Arial" w:cs="Arial"/>
-        </w:rPr>
-        <w:t> com as colunas: </w:t>
-      </w:r>
-      <w:r>
-        <w:rPr>
-          <w:rFonts w:ascii="Arial" w:hAnsi="Arial" w:cs="Arial"/>
-          <w:b/>
-          <w:bCs/>
-        </w:rPr>
-        <w:t>Semana | PDV | Produto | Quantidade.</w:t>
+          <w:rFonts w:ascii="Segoe UI Emoji" w:hAnsi="Segoe UI Emoji" w:cs="Segoe UI Emoji"/>
+        </w:rPr>
+        <w:t>📂</w:t>
+      </w:r>
+      <w:r>
+        <w:rPr>
+          <w:rFonts w:ascii="Arial" w:hAnsi="Arial" w:cs="Arial"/>
+        </w:rPr>
+        <w:t xml:space="preserve"> data → arquivos de entrada (.parquet)</w:t>
+      </w:r>
+      <w:r>
+        <w:rPr>
+          <w:rFonts w:ascii="Arial" w:hAnsi="Arial" w:cs="Arial"/>
+        </w:rPr>
+        <w:br/>
+      </w:r>
+      <w:r>
+        <w:rPr>
+          <w:rFonts w:ascii="Arial" w:eastAsia="MS Gothic" w:hAnsi="Arial" w:cs="Arial"/>
+        </w:rPr>
+        <w:t xml:space="preserve">      </w:t>
+      </w:r>
+      <w:r>
+        <w:rPr>
+          <w:rFonts w:ascii="Arial" w:eastAsia="MS Gothic" w:hAnsi="Arial" w:cs="Arial"/>
+        </w:rPr>
+        <w:t xml:space="preserve">    </w:t>
+      </w:r>
+      <w:r>
+        <w:rPr>
+          <w:rFonts w:ascii="MS Gothic" w:eastAsia="MS Gothic" w:hAnsi="MS Gothic" w:cs="MS Gothic" w:hint="eastAsia"/>
+        </w:rPr>
+        <w:t>┣</w:t>
+      </w:r>
+      <w:r>
+        <w:rPr>
+          <w:rFonts w:ascii="Arial" w:hAnsi="Arial" w:cs="Arial"/>
+        </w:rPr>
+        <w:t xml:space="preserve"> </w:t>
+      </w:r>
+      <w:r>
+        <w:rPr>
+          <w:rFonts w:ascii="Segoe UI Emoji" w:hAnsi="Segoe UI Emoji" w:cs="Segoe UI Emoji"/>
+        </w:rPr>
+        <w:t>📂</w:t>
+      </w:r>
+      <w:r>
+        <w:rPr>
+          <w:rFonts w:ascii="Arial" w:hAnsi="Arial" w:cs="Arial"/>
+        </w:rPr>
+        <w:t xml:space="preserve"> docs → saídas</w:t>
+      </w:r>
+      <w:r>
+        <w:rPr>
+          <w:rFonts w:ascii="Arial" w:hAnsi="Arial" w:cs="Arial"/>
+        </w:rPr>
+        <w:t>,</w:t>
+      </w:r>
+      <w:r>
+        <w:rPr>
+          <w:rFonts w:ascii="Arial" w:hAnsi="Arial" w:cs="Arial"/>
+        </w:rPr>
+        <w:t xml:space="preserve"> relatórios</w:t>
+      </w:r>
+      <w:r>
+        <w:rPr>
+          <w:rFonts w:ascii="Arial" w:hAnsi="Arial" w:cs="Arial"/>
+        </w:rPr>
+        <w:t xml:space="preserve"> e documentações</w:t>
+      </w:r>
+      <w:r>
+        <w:rPr>
+          <w:rFonts w:ascii="Arial" w:hAnsi="Arial" w:cs="Arial"/>
+        </w:rPr>
+        <w:br/>
+      </w:r>
+      <w:r>
+        <w:rPr>
+          <w:rFonts w:ascii="Arial" w:eastAsia="MS Gothic" w:hAnsi="Arial" w:cs="Arial"/>
+        </w:rPr>
+        <w:t xml:space="preserve">      </w:t>
+      </w:r>
+      <w:r>
+        <w:rPr>
+          <w:rFonts w:ascii="Arial" w:eastAsia="MS Gothic" w:hAnsi="Arial" w:cs="Arial"/>
+        </w:rPr>
+        <w:t xml:space="preserve">    </w:t>
+      </w:r>
+      <w:r>
+        <w:rPr>
+          <w:rFonts w:ascii="MS Gothic" w:eastAsia="MS Gothic" w:hAnsi="MS Gothic" w:cs="MS Gothic" w:hint="eastAsia"/>
+        </w:rPr>
+        <w:t>┣</w:t>
+      </w:r>
+      <w:r>
+        <w:rPr>
+          <w:rFonts w:ascii="Arial" w:hAnsi="Arial" w:cs="Arial"/>
+        </w:rPr>
+        <w:t xml:space="preserve"> </w:t>
+      </w:r>
+      <w:r>
+        <w:rPr>
+          <w:rFonts w:ascii="Segoe UI Emoji" w:hAnsi="Segoe UI Emoji" w:cs="Segoe UI Emoji"/>
+        </w:rPr>
+        <w:t>📂</w:t>
+      </w:r>
+      <w:r>
+        <w:rPr>
+          <w:rFonts w:ascii="Arial" w:hAnsi="Arial" w:cs="Arial"/>
+        </w:rPr>
+        <w:t xml:space="preserve"> src → código (.py, .ipynb)</w:t>
+      </w:r>
+    </w:p>
+    <w:p>
+      <w:pPr>
+        <w:spacing w:after="0" w:line="240" w:lineRule="auto"/>
+        <w:rPr>
+          <w:rFonts w:ascii="Arial" w:hAnsi="Arial" w:cs="Arial"/>
+        </w:rPr>
+      </w:pPr>
+      <w:r>
+        <w:rPr>
+          <w:rFonts w:ascii="Arial" w:hAnsi="Arial" w:cs="Arial"/>
+        </w:rPr>
+        <w:t xml:space="preserve">          </w:t>
+      </w:r>
+      <w:r>
+        <w:rPr>
+          <w:rFonts w:ascii="MS Gothic" w:eastAsia="MS Gothic" w:hAnsi="MS Gothic" w:cs="MS Gothic" w:hint="eastAsia"/>
+        </w:rPr>
+        <w:t>┣</w:t>
+      </w:r>
+      <w:r>
+        <w:rPr>
+          <w:rFonts w:ascii="Arial" w:eastAsia="MS Gothic" w:hAnsi="Arial" w:cs="Arial"/>
+        </w:rPr>
+        <w:t xml:space="preserve"> README.md, requirements.txt</w:t>
+      </w:r>
+    </w:p>
+    <w:p>
+      <w:pPr>
+        <w:spacing w:after="0" w:line="240" w:lineRule="auto"/>
+        <w:rPr>
+          <w:rFonts w:ascii="Segoe UI Emoji" w:hAnsi="Segoe UI Emoji" w:cs="Segoe UI Emoji"/>
+          <w:b/>
+          <w:bCs/>
+        </w:rPr>
+      </w:pPr>
+    </w:p>
+    <w:p>
+      <w:pPr>
+        <w:spacing w:after="0" w:line="240" w:lineRule="auto"/>
+        <w:rPr>
+          <w:rFonts w:ascii="Arial" w:hAnsi="Arial" w:cs="Arial"/>
+          <w:b/>
+          <w:bCs/>
+        </w:rPr>
+      </w:pPr>
+      <w:r>
+        <w:rPr>
+          <w:rFonts w:ascii="Segoe UI Emoji" w:hAnsi="Segoe UI Emoji" w:cs="Segoe UI Emoji"/>
+          <w:b/>
+          <w:bCs/>
+        </w:rPr>
+        <w:t>📑</w:t>
+      </w:r>
+      <w:r>
+        <w:rPr>
+          <w:rFonts w:ascii="Arial" w:hAnsi="Arial" w:cs="Arial"/>
+          <w:b/>
+          <w:bCs/>
+        </w:rPr>
+        <w:t> Entregáveis</w:t>
       </w:r>
     </w:p>
     <w:p>
@@ -800,6 +1447,99 @@
         <w:rPr>
           <w:rFonts w:ascii="Arial" w:hAnsi="Arial" w:cs="Arial"/>
         </w:rPr>
+        <w:t>Arquivo final </w:t>
+      </w:r>
+      <w:r>
+        <w:rPr>
+          <w:rFonts w:ascii="Arial" w:hAnsi="Arial" w:cs="Arial"/>
+          <w:b/>
+          <w:bCs/>
+        </w:rPr>
+        <w:t>.csv</w:t>
+      </w:r>
+      <w:r>
+        <w:rPr>
+          <w:rFonts w:ascii="Arial" w:hAnsi="Arial" w:cs="Arial"/>
+        </w:rPr>
+        <w:t> ou </w:t>
+      </w:r>
+      <w:r>
+        <w:rPr>
+          <w:rFonts w:ascii="Arial" w:hAnsi="Arial" w:cs="Arial"/>
+          <w:b/>
+          <w:bCs/>
+        </w:rPr>
+        <w:t>.parquet</w:t>
+      </w:r>
+      <w:r>
+        <w:rPr>
+          <w:rFonts w:ascii="Arial" w:hAnsi="Arial" w:cs="Arial"/>
+          <w:b/>
+          <w:bCs/>
+        </w:rPr>
+        <w:t xml:space="preserve"> </w:t>
+      </w:r>
+      <w:r>
+        <w:rPr>
+          <w:rFonts w:ascii="Arial" w:hAnsi="Arial" w:cs="Arial"/>
+          <w:b/>
+          <w:bCs/>
+          <w:i/>
+          <w:iCs/>
+        </w:rPr>
+        <w:t>(vou trabalhar com .csv</w:t>
+      </w:r>
+      <w:r>
+        <w:rPr>
+          <w:rFonts w:ascii="Arial" w:hAnsi="Arial" w:cs="Arial"/>
+          <w:b/>
+          <w:bCs/>
+          <w:i/>
+          <w:iCs/>
+        </w:rPr>
+        <w:t xml:space="preserve"> – meu arquivo final deverá ficar em .csv</w:t>
+      </w:r>
+      <w:r>
+        <w:rPr>
+          <w:rFonts w:ascii="Arial" w:hAnsi="Arial" w:cs="Arial"/>
+          <w:b/>
+          <w:bCs/>
+          <w:i/>
+          <w:iCs/>
+        </w:rPr>
+        <w:t>)</w:t>
+      </w:r>
+      <w:r>
+        <w:rPr>
+          <w:rFonts w:ascii="Arial" w:hAnsi="Arial" w:cs="Arial"/>
+        </w:rPr>
+        <w:t> com as colunas: </w:t>
+      </w:r>
+      <w:r>
+        <w:rPr>
+          <w:rFonts w:ascii="Arial" w:hAnsi="Arial" w:cs="Arial"/>
+          <w:b/>
+          <w:bCs/>
+        </w:rPr>
+        <w:t>Semana | PDV | Produto | Quantidade.</w:t>
+      </w:r>
+    </w:p>
+    <w:p>
+      <w:pPr>
+        <w:pStyle w:val="PargrafodaLista"/>
+        <w:numPr>
+          <w:ilvl w:val="0"/>
+          <w:numId w:val="1"/>
+        </w:numPr>
+        <w:spacing w:after="0" w:line="240" w:lineRule="auto"/>
+        <w:rPr>
+          <w:rFonts w:ascii="Arial" w:hAnsi="Arial" w:cs="Arial"/>
+        </w:rPr>
+      </w:pPr>
+      <w:r>
+        <w:rPr>
+          <w:rFonts w:ascii="Arial" w:hAnsi="Arial" w:cs="Arial"/>
+        </w:rPr>
         <w:t>Repositório público no GitHub com código e documentação da solução.</w:t>
       </w:r>
     </w:p>
@@ -855,7 +1595,7 @@
           <w:b/>
           <w:bCs/>
         </w:rPr>
-        <w:t>CSV ou Parquet</w:t>
+        <w:t>CSV</w:t>
       </w:r>
       <w:r>
         <w:rPr>
@@ -929,7 +1669,6 @@
                 <w:b/>
                 <w:bCs/>
               </w:rPr>
-              <w:lastRenderedPageBreak/>
               <w:t>semana</w:t>
             </w:r>
           </w:p>
@@ -1942,6 +2681,7 @@
           <w:b/>
           <w:bCs/>
         </w:rPr>
+        <w:lastRenderedPageBreak/>
         <w:t>Qualidade técnica da entrega</w:t>
       </w:r>
       <w:r>
@@ -2050,19 +2790,7 @@
         <w:rPr>
           <w:rFonts w:ascii="Arial" w:hAnsi="Arial" w:cs="Arial"/>
         </w:rPr>
-        <w:t> </w:t>
-      </w:r>
-      <w:r>
-        <w:rPr>
-          <w:rFonts w:ascii="Arial" w:hAnsi="Arial" w:cs="Arial"/>
-        </w:rPr>
-        <w:t>O</w:t>
-      </w:r>
-      <w:r>
-        <w:rPr>
-          <w:rFonts w:ascii="Arial" w:hAnsi="Arial" w:cs="Arial"/>
-        </w:rPr>
-        <w:t xml:space="preserve"> código enviado deve ser executável e gerar os resultados apresentados. Caso todas as soluções falhem neste requisito, nenhuma equipe será premiada.</w:t>
+        <w:t> O código enviado deve ser executável e gerar os resultados apresentados. Caso todas as soluções falhem neste requisito, nenhuma equipe será premiada.</w:t>
       </w:r>
     </w:p>
     <w:p>
@@ -2396,7 +3124,6 @@
           <w:b/>
           <w:bCs/>
         </w:rPr>
-        <w:lastRenderedPageBreak/>
         <w:t>📬</w:t>
       </w:r>
       <w:r>
@@ -2473,104 +3200,6 @@
           <w:rFonts w:ascii="Arial" w:hAnsi="Arial" w:cs="Arial"/>
         </w:rPr>
       </w:pPr>
-    </w:p>
-    <w:p>
-      <w:pPr>
-        <w:spacing w:after="0" w:line="240" w:lineRule="auto"/>
-        <w:rPr>
-          <w:rFonts w:ascii="Arial" w:hAnsi="Arial" w:cs="Arial"/>
-        </w:rPr>
-      </w:pPr>
-    </w:p>
-    <w:p>
-      <w:pPr>
-        <w:spacing w:after="0" w:line="240" w:lineRule="auto"/>
-        <w:rPr>
-          <w:rFonts w:ascii="Arial" w:hAnsi="Arial" w:cs="Arial"/>
-        </w:rPr>
-      </w:pPr>
-    </w:p>
-    <w:p>
-      <w:pPr>
-        <w:spacing w:after="0" w:line="240" w:lineRule="auto"/>
-        <w:rPr>
-          <w:rFonts w:ascii="Arial" w:hAnsi="Arial" w:cs="Arial"/>
-        </w:rPr>
-      </w:pPr>
-    </w:p>
-    <w:p>
-      <w:pPr>
-        <w:spacing w:after="0" w:line="240" w:lineRule="auto"/>
-        <w:rPr>
-          <w:rFonts w:ascii="Arial" w:hAnsi="Arial" w:cs="Arial"/>
-        </w:rPr>
-      </w:pPr>
-    </w:p>
-    <w:p>
-      <w:pPr>
-        <w:spacing w:after="0" w:line="240" w:lineRule="auto"/>
-        <w:rPr>
-          <w:rFonts w:ascii="Arial" w:hAnsi="Arial" w:cs="Arial"/>
-        </w:rPr>
-      </w:pPr>
-    </w:p>
-    <w:p>
-      <w:pPr>
-        <w:spacing w:after="0" w:line="240" w:lineRule="auto"/>
-        <w:rPr>
-          <w:rFonts w:ascii="Arial" w:hAnsi="Arial" w:cs="Arial"/>
-        </w:rPr>
-      </w:pPr>
-      <w:r>
-        <w:rPr>
-          <w:rFonts w:ascii="Arial" w:hAnsi="Arial" w:cs="Arial"/>
-        </w:rPr>
-        <w:t>Quero que haja como expert, profissional altamente capacitado, experiente em desenvolvimento em Python para desenvolver o código com a finalidade de Análise de Dados e Ciência de Dados, Machine Learning e IA para desenvolver e apresentar o melhor código (sempre bem detalhado) e o resultado necessário para o objetivo.</w:t>
-      </w:r>
-    </w:p>
-    <w:p>
-      <w:pPr>
-        <w:spacing w:after="0" w:line="240" w:lineRule="auto"/>
-        <w:rPr>
-          <w:rFonts w:ascii="Arial" w:hAnsi="Arial" w:cs="Arial"/>
-        </w:rPr>
-      </w:pPr>
-    </w:p>
-    <w:p>
-      <w:pPr>
-        <w:spacing w:after="0" w:line="240" w:lineRule="auto"/>
-        <w:rPr>
-          <w:rFonts w:ascii="Arial" w:hAnsi="Arial" w:cs="Arial"/>
-        </w:rPr>
-      </w:pPr>
-      <w:r>
-        <w:rPr>
-          <w:rFonts w:ascii="Arial" w:hAnsi="Arial" w:cs="Arial"/>
-        </w:rPr>
-        <w:t xml:space="preserve">Deve, ao final, apresentar os dados de forma profissional em um ambiente de dashboad dinâmico, em DASH, usando gráfico em Plotly (para gráficos dinâmicos), mas também poder utilizar Matplotlib ou Seaborn. Ter a possibilidade de </w:t>
-      </w:r>
-    </w:p>
-    <w:p>
-      <w:pPr>
-        <w:spacing w:after="0" w:line="240" w:lineRule="auto"/>
-        <w:rPr>
-          <w:rFonts w:ascii="Arial" w:hAnsi="Arial" w:cs="Arial"/>
-        </w:rPr>
-      </w:pPr>
-    </w:p>
-    <w:p>
-      <w:pPr>
-        <w:spacing w:after="0" w:line="240" w:lineRule="auto"/>
-        <w:rPr>
-          <w:rFonts w:ascii="Arial" w:hAnsi="Arial" w:cs="Arial"/>
-        </w:rPr>
-      </w:pPr>
-      <w:r>
-        <w:rPr>
-          <w:rFonts w:ascii="Arial" w:hAnsi="Arial" w:cs="Arial"/>
-        </w:rPr>
-        <w:t>Apresentar os resultados desejados</w:t>
-      </w:r>
     </w:p>
     <w:sectPr>
       <w:pgSz w:w="11906" w:h="16838"/>
@@ -4116,6 +4745,95 @@
           <w:tab w:val="num" w:pos="6480"/>
         </w:tabs>
         <w:ind w:left="6480" w:hanging="360"/>
+      </w:pPr>
+    </w:lvl>
+  </w:abstractNum>
+  <w:abstractNum w:abstractNumId="11" w15:restartNumberingAfterBreak="0">
+    <w:nsid w:val="6F9455B0"/>
+    <w:multiLevelType w:val="hybridMultilevel"/>
+    <w:tmpl w:val="E1F4D5F6"/>
+    <w:lvl w:ilvl="0" w:tplc="0416000F">
+      <w:start w:val="1"/>
+      <w:numFmt w:val="decimal"/>
+      <w:lvlText w:val="%1."/>
+      <w:lvlJc w:val="left"/>
+      <w:pPr>
+        <w:ind w:left="720" w:hanging="360"/>
+      </w:pPr>
+      <w:rPr>
+        <w:rFonts w:hint="default"/>
+      </w:rPr>
+    </w:lvl>
+    <w:lvl w:ilvl="1" w:tplc="04160019" w:tentative="1">
+      <w:start w:val="1"/>
+      <w:numFmt w:val="lowerLetter"/>
+      <w:lvlText w:val="%2."/>
+      <w:lvlJc w:val="left"/>
+      <w:pPr>
+        <w:ind w:left="1440" w:hanging="360"/>
+      </w:pPr>
+    </w:lvl>
+    <w:lvl w:ilvl="2" w:tplc="0416001B" w:tentative="1">
+      <w:start w:val="1"/>
+      <w:numFmt w:val="lowerRoman"/>
+      <w:lvlText w:val="%3."/>
+      <w:lvlJc w:val="right"/>
+      <w:pPr>
+        <w:ind w:left="2160" w:hanging="180"/>
+      </w:pPr>
+    </w:lvl>
+    <w:lvl w:ilvl="3" w:tplc="0416000F" w:tentative="1">
+      <w:start w:val="1"/>
+      <w:numFmt w:val="decimal"/>
+      <w:lvlText w:val="%4."/>
+      <w:lvlJc w:val="left"/>
+      <w:pPr>
+        <w:ind w:left="2880" w:hanging="360"/>
+      </w:pPr>
+    </w:lvl>
+    <w:lvl w:ilvl="4" w:tplc="04160019" w:tentative="1">
+      <w:start w:val="1"/>
+      <w:numFmt w:val="lowerLetter"/>
+      <w:lvlText w:val="%5."/>
+      <w:lvlJc w:val="left"/>
+      <w:pPr>
+        <w:ind w:left="3600" w:hanging="360"/>
+      </w:pPr>
+    </w:lvl>
+    <w:lvl w:ilvl="5" w:tplc="0416001B" w:tentative="1">
+      <w:start w:val="1"/>
+      <w:numFmt w:val="lowerRoman"/>
+      <w:lvlText w:val="%6."/>
+      <w:lvlJc w:val="right"/>
+      <w:pPr>
+        <w:ind w:left="4320" w:hanging="180"/>
+      </w:pPr>
+    </w:lvl>
+    <w:lvl w:ilvl="6" w:tplc="0416000F" w:tentative="1">
+      <w:start w:val="1"/>
+      <w:numFmt w:val="decimal"/>
+      <w:lvlText w:val="%7."/>
+      <w:lvlJc w:val="left"/>
+      <w:pPr>
+        <w:ind w:left="5040" w:hanging="360"/>
+      </w:pPr>
+    </w:lvl>
+    <w:lvl w:ilvl="7" w:tplc="04160019" w:tentative="1">
+      <w:start w:val="1"/>
+      <w:numFmt w:val="lowerLetter"/>
+      <w:lvlText w:val="%8."/>
+      <w:lvlJc w:val="left"/>
+      <w:pPr>
+        <w:ind w:left="5760" w:hanging="360"/>
+      </w:pPr>
+    </w:lvl>
+    <w:lvl w:ilvl="8" w:tplc="0416001B" w:tentative="1">
+      <w:start w:val="1"/>
+      <w:numFmt w:val="lowerRoman"/>
+      <w:lvlText w:val="%9."/>
+      <w:lvlJc w:val="right"/>
+      <w:pPr>
+        <w:ind w:left="6480" w:hanging="180"/>
       </w:pPr>
     </w:lvl>
   </w:abstractNum>
@@ -4151,6 +4869,9 @@
   </w:num>
   <w:num w:numId="11" w16cid:durableId="439421903">
     <w:abstractNumId w:val="0"/>
+  </w:num>
+  <w:num w:numId="12" w16cid:durableId="940529055">
+    <w:abstractNumId w:val="11"/>
   </w:num>
 </w:numbering>
 </file>

</xml_diff>